<commit_message>
agent-memory-governance: PI edits to memo v5 and skills survey partial
Co-Authored-By: Claude Opus 5.5 <noreply@anthropic.com>
</commit_message>
<xml_diff>
--- a/projects/agent-memory-governance/inputs/RockAI_Agent_Memory_Regulatory_Governance_Research_Memo_v5.docx
+++ b/projects/agent-memory-governance/inputs/RockAI_Agent_Memory_Regulatory_Governance_Research_Memo_v5.docx
@@ -8238,8 +8238,8 @@
       </w:tblPr>
       <w:tblGrid>
         <w:gridCol w:w="2098"/>
-        <w:gridCol w:w="4172"/>
-        <w:gridCol w:w="3882"/>
+        <w:gridCol w:w="4169"/>
+        <w:gridCol w:w="3885"/>
       </w:tblGrid>
       <w:tr>
         <w:trPr>
@@ -8732,6 +8732,82 @@
           </w:p>
         </w:tc>
       </w:tr>
+      <w:tr>
+        <w:trPr>
+          <w:jc w:val="center"/>
+        </w:trPr>
+        <w:tc>
+          <w:tcPr>
+            <w:tcW w:w="2160" w:type="dxa"/>
+            <w:vAlign w:val="center"/>
+          </w:tcPr>
+          <w:p>
+            <w:pPr>
+              <w:rPr>
+                <w:sz w:val="16"/>
+              </w:rPr>
+            </w:pPr>
+            <w:r>
+              <w:rPr>
+                <w:sz w:val="16"/>
+              </w:rPr>
+              <w:t>Bias contagion</w:t>
+            </w:r>
+          </w:p>
+        </w:tc>
+        <w:tc>
+          <w:tcPr>
+            <w:tcW w:w="4320" w:type="dxa"/>
+            <w:vAlign w:val="center"/>
+          </w:tcPr>
+          <w:p>
+            <w:pPr>
+              <w:rPr>
+                <w:sz w:val="16"/>
+              </w:rPr>
+            </w:pPr>
+            <w:r>
+              <w:rPr>
+                <w:sz w:val="16"/>
+              </w:rPr>
+              <w:t xml:space="preserve">Evaluator or source bias present in the underlying experience stream </w:t>
+            </w:r>
+            <w:proofErr w:type="spellStart"/>
+            <w:r>
+              <w:rPr>
+                <w:sz w:val="16"/>
+              </w:rPr>
+              <w:t>propogates</w:t>
+            </w:r>
+            <w:proofErr w:type="spellEnd"/>
+            <w:r>
+              <w:rPr>
+                <w:sz w:val="16"/>
+              </w:rPr>
+              <w:t xml:space="preserve"> through memory even when the consolidation mechanism itself performs perfectly (an “oracle” condition)</w:t>
+            </w:r>
+          </w:p>
+        </w:tc>
+        <w:tc>
+          <w:tcPr>
+            <w:tcW w:w="4032" w:type="dxa"/>
+            <w:vAlign w:val="center"/>
+          </w:tcPr>
+          <w:p>
+            <w:pPr>
+              <w:rPr>
+                <w:sz w:val="16"/>
+              </w:rPr>
+            </w:pPr>
+            <w:r>
+              <w:rPr>
+                <w:sz w:val="16"/>
+              </w:rPr>
+              <w:t>Sample and test the upstream experience/evaluation stream.</w:t>
+            </w:r>
+          </w:p>
+        </w:tc>
+      </w:tr>
     </w:tbl>
     <w:p>
       <w:pPr>
@@ -8747,7 +8823,11 @@
         <w:t xml:space="preserve">bias contagion through unbiased consolidation. </w:t>
       </w:r>
       <w:r>
-        <w:t>Recent research ("Memory Contagion") demonstrates that evaluator or source bias present in the underlying experience stream propagates through memory even when the consolidation mechanism itself performs perfectly (an "oracle" condition), with contamination detectable at rates as low as 20% and no observed safe threshold. [R29] The practical implication is that C6 drift/quality monitoring cannot rely on validating the consolidation mechanism alone; it must also sample and test the upstream experience/evaluation stream, since a technically correct consolidator will faithfully preserve and propagate bias that was already present in what it was given to consolidate. ENISA's autonomous-agent threat taxonomy independently lists "data poisoning through memory" alongside identity spoofing and privilege escalation, and the forthcoming prEN 18282 cybersecurity standard is scoped to those concerns; the threat classes above should be cross-referenced to both when the specification is drafted. [R43]</w:t>
+        <w:t xml:space="preserve">Recent research ("Memory Contagion") demonstrates that evaluator or source bias present in the underlying experience stream propagates through memory even when the consolidation mechanism itself performs perfectly (an "oracle" condition), with contamination detectable at rates as low as 20% and no observed safe threshold. [R29] The practical implication is that C6 drift/quality monitoring cannot rely on validating the consolidation mechanism alone; it must also sample and test the upstream experience/evaluation stream, since a technically correct consolidator will faithfully preserve and propagate bias that was already present in what it was given to consolidate. ENISA's autonomous-agent threat taxonomy independently lists "data poisoning through memory" alongside identity spoofing and privilege escalation, and the forthcoming prEN 18282 </w:t>
+      </w:r>
+      <w:r>
+        <w:lastRenderedPageBreak/>
+        <w:t>cybersecurity standard is scoped to those concerns; the threat classes above should be cross-referenced to both when the specification is drafted. [R43]</w:t>
       </w:r>
     </w:p>
     <w:p>
@@ -8755,7 +8835,6 @@
         <w:pStyle w:val="Heading2"/>
       </w:pPr>
       <w:r>
-        <w:lastRenderedPageBreak/>
         <w:t>13.1 Threat model as an interface × actor matrix</w:t>
       </w:r>
     </w:p>
@@ -9345,6 +9424,7 @@
         <w:rPr>
           <w:b/>
         </w:rPr>
+        <w:lastRenderedPageBreak/>
         <w:t xml:space="preserve">Privacy/rights gate. </w:t>
       </w:r>
       <w:r>
@@ -9360,7 +9440,6 @@
         <w:rPr>
           <w:b/>
         </w:rPr>
-        <w:lastRenderedPageBreak/>
         <w:t xml:space="preserve">Memory-quality gate. </w:t>
       </w:r>
       <w:r>
@@ -9855,6 +9934,7 @@
               <w:rPr>
                 <w:sz w:val="16"/>
               </w:rPr>
+              <w:lastRenderedPageBreak/>
               <w:t>Promotion Regression Rate</w:t>
             </w:r>
           </w:p>
@@ -9920,7 +10000,6 @@
         <w:pStyle w:val="Heading2"/>
       </w:pPr>
       <w:r>
-        <w:lastRenderedPageBreak/>
         <w:t>15.0 Provenance of the metric set</w:t>
       </w:r>
     </w:p>
@@ -10769,6 +10848,7 @@
         <w:rPr>
           <w:b/>
         </w:rPr>
+        <w:lastRenderedPageBreak/>
         <w:t xml:space="preserve">Governance Latency Overhead (GLO). </w:t>
       </w:r>
       <w:r>
@@ -10778,6 +10858,603 @@
     <w:p>
       <w:pPr>
         <w:pStyle w:val="ListBullet"/>
+        <w:spacing w:after="60"/>
+      </w:pPr>
+      <w:r>
+        <w:rPr>
+          <w:b/>
+        </w:rPr>
+        <w:t xml:space="preserve">Effective Policy Coverage (EPC). </w:t>
+      </w:r>
+      <w:r>
+        <w:t>Persisted memories with a resolvable effective_policy_hash ÷ persisted memories. Target: 100%; an unpolicied memory is a defect.</w:t>
+      </w:r>
+    </w:p>
+    <w:p>
+      <w:pPr>
+        <w:pStyle w:val="ListBullet"/>
+        <w:spacing w:after="60"/>
+      </w:pPr>
+      <w:r>
+        <w:rPr>
+          <w:b/>
+        </w:rPr>
+        <w:t xml:space="preserve">Time-to-Erasure (TTE). </w:t>
+      </w:r>
+      <w:r>
+        <w:t>Elapsed time from a valid deletion request to physical-layer verification across all representations, against the retention/rights SLA.</w:t>
+      </w:r>
+    </w:p>
+    <w:p>
+      <w:pPr>
+        <w:pStyle w:val="ListBullet"/>
+        <w:spacing w:after="60"/>
+      </w:pPr>
+      <w:r>
+        <w:rPr>
+          <w:b/>
+        </w:rPr>
+        <w:t xml:space="preserve">Consolidation Review Rejection Rate. </w:t>
+      </w:r>
+      <w:r>
+        <w:t>Proposed consolidation diffs rejected by policy check or reviewer ÷ proposed diffs; a rising rate indicates upstream contamination (Memory Contagion) or extractor drift.</w:t>
+      </w:r>
+    </w:p>
+    <w:p>
+      <w:pPr>
+        <w:spacing w:after="100" w:line="252" w:lineRule="auto"/>
+      </w:pPr>
+      <w:r>
+        <w:t>SMUR as defined requires an attribution rule: retrieved is not used. A workable proxy is "present in the assembled context and referenced in the output"; the specification should state the rule so that the metric is comparable across releases. "Effectively zero" targets should be read as zero in conformance runs and an alert on first occurrence in production, measured by canaries.</w:t>
+      </w:r>
+    </w:p>
+    <w:p>
+      <w:pPr>
+        <w:pStyle w:val="Heading1"/>
+      </w:pPr>
+      <w:r>
+        <w:t>16. Recommended Implementation and Research Roadmap</w:t>
+      </w:r>
+    </w:p>
+    <w:p>
+      <w:pPr>
+        <w:pStyle w:val="Heading2"/>
+      </w:pPr>
+      <w:r>
+        <w:t>Phase 0 — Legal / scope confirmation</w:t>
+      </w:r>
+    </w:p>
+    <w:p>
+      <w:pPr>
+        <w:pStyle w:val="ListBullet"/>
+        <w:spacing w:after="50"/>
+      </w:pPr>
+      <w:r>
+        <w:rPr>
+          <w:b/>
+        </w:rPr>
+        <w:t xml:space="preserve">Use-case classification. </w:t>
+      </w:r>
+      <w:r>
+        <w:t>Determine where memory will be used: internal research, advisory workflow, client-facing application, decision support, or platform infrastructure.</w:t>
+      </w:r>
+    </w:p>
+    <w:p>
+      <w:pPr>
+        <w:pStyle w:val="ListBullet"/>
+        <w:spacing w:after="50"/>
+      </w:pPr>
+      <w:r>
+        <w:rPr>
+          <w:b/>
+        </w:rPr>
+        <w:t xml:space="preserve">Entity and jurisdiction mapping. </w:t>
+      </w:r>
+      <w:r>
+        <w:t>Identify relevant operating entities, data-subject locations, controller/processor roles, record categories, information barriers and applicable retention obligations.</w:t>
+      </w:r>
+    </w:p>
+    <w:p>
+      <w:pPr>
+        <w:pStyle w:val="ListBullet"/>
+        <w:spacing w:after="50"/>
+      </w:pPr>
+      <w:r>
+        <w:rPr>
+          <w:b/>
+        </w:rPr>
+        <w:t xml:space="preserve">Third-party relationship mapping. </w:t>
+      </w:r>
+      <w:r>
+        <w:t>Distinguish self-hosted OSS from hosted services and map the actual dependency/service chain.</w:t>
+      </w:r>
+    </w:p>
+    <w:p>
+      <w:pPr>
+        <w:pStyle w:val="ListBullet"/>
+        <w:spacing w:after="50"/>
+      </w:pPr>
+      <w:r>
+        <w:rPr>
+          <w:b/>
+        </w:rPr>
+        <w:t xml:space="preserve">Legal review. </w:t>
+      </w:r>
+      <w:r>
+        <w:t>Confirm GDPR legal bases, special-category handling, international transfers, Regulation S-P scope, adviser recordkeeping, and high-risk AI Act applicability by use case.</w:t>
+      </w:r>
+    </w:p>
+    <w:p>
+      <w:pPr>
+        <w:pStyle w:val="ListBullet"/>
+        <w:spacing w:after="60"/>
+      </w:pPr>
+      <w:r>
+        <w:rPr>
+          <w:b/>
+        </w:rPr>
+        <w:t xml:space="preserve">Governance latency budget. </w:t>
+      </w:r>
+      <w:r>
+        <w:t>Set the p95 governance-overhead budget per memory operation on the retrieval hot path (Section 9.1); it is a design input, not a tuning parameter.</w:t>
+      </w:r>
+    </w:p>
+    <w:p>
+      <w:pPr>
+        <w:pStyle w:val="ListBullet"/>
+        <w:spacing w:after="60"/>
+      </w:pPr>
+      <w:r>
+        <w:rPr>
+          <w:b/>
+        </w:rPr>
+        <w:t xml:space="preserve">Bank-supervised entity check. </w:t>
+      </w:r>
+      <w:r>
+        <w:t>Confirm whether any entity operating memory is separately Fed/OCC/FDIC-supervised; if so SR 26-2 becomes directly binding rather than an analogue (Section 5.4).</w:t>
+      </w:r>
+    </w:p>
+    <w:p>
+      <w:pPr>
+        <w:pStyle w:val="Heading2"/>
+      </w:pPr>
+      <w:r>
+        <w:t>Phase 1 — Foundational controls before production persistent memory</w:t>
+      </w:r>
+    </w:p>
+    <w:p>
+      <w:pPr>
+        <w:pStyle w:val="ListBullet"/>
+        <w:spacing w:after="50"/>
+      </w:pPr>
+      <w:r>
+        <w:t>C1 lineage/provenance and C26 technology-version lineage.</w:t>
+      </w:r>
+    </w:p>
+    <w:p>
+      <w:pPr>
+        <w:pStyle w:val="ListBullet"/>
+        <w:spacing w:after="50"/>
+      </w:pPr>
+      <w:r>
+        <w:t>C13 purpose/legal-basis binding and C21 purpose-bound use authorization.</w:t>
+      </w:r>
+    </w:p>
+    <w:p>
+      <w:pPr>
+        <w:pStyle w:val="ListBullet"/>
+        <w:spacing w:after="50"/>
+      </w:pPr>
+      <w:r>
+        <w:t>C16 observed/extracted/inferred/derived classification and C20 source-authority hierarchy.</w:t>
+      </w:r>
+    </w:p>
+    <w:p>
+      <w:pPr>
+        <w:pStyle w:val="ListBullet"/>
+        <w:spacing w:after="50"/>
+      </w:pPr>
+      <w:r>
+        <w:t>C17 tenant/semantic isolation, C19 information barriers/MNPI, C23 operation-level authorization.</w:t>
+      </w:r>
+    </w:p>
+    <w:p>
+      <w:pPr>
+        <w:pStyle w:val="ListBullet"/>
+        <w:spacing w:after="50"/>
+      </w:pPr>
+      <w:r>
+        <w:t>C11 provider/region/egress pinning and full data-flow inventory.</w:t>
+      </w:r>
+    </w:p>
+    <w:p>
+      <w:pPr>
+        <w:pStyle w:val="ListBullet"/>
+        <w:spacing w:after="50"/>
+      </w:pPr>
+      <w:r>
+        <w:t>C3 tamper-evident audit trail that avoids copying sensitive content unnecessarily.</w:t>
+      </w:r>
+    </w:p>
+    <w:p>
+      <w:pPr>
+        <w:pStyle w:val="ListBullet"/>
+        <w:spacing w:after="50"/>
+      </w:pPr>
+      <w:r>
+        <w:t>C7 retention/legal hold and C24 lifecycle states.</w:t>
+      </w:r>
+    </w:p>
+    <w:p>
+      <w:pPr>
+        <w:pStyle w:val="ListBullet"/>
+        <w:spacing w:after="50"/>
+      </w:pPr>
+      <w:r>
+        <w:t>C2 end-to-end deletion primitives with verification.</w:t>
+      </w:r>
+    </w:p>
+    <w:p>
+      <w:pPr>
+        <w:pStyle w:val="ListBullet"/>
+        <w:spacing w:after="50"/>
+      </w:pPr>
+      <w:r>
+        <w:t>C5/C10 OSS security and threat-model controls.</w:t>
+      </w:r>
+    </w:p>
+    <w:p>
+      <w:pPr>
+        <w:pStyle w:val="ListBullet"/>
+        <w:spacing w:after="60"/>
+      </w:pPr>
+      <w:r>
+        <w:rPr>
+          <w:b/>
+        </w:rPr>
+        <w:t xml:space="preserve">Architecture hardening (Section 9.1). </w:t>
+      </w:r>
+      <w:r>
+        <w:t>Enforced bypass prevention (backend credentials only in the gateway, mTLS, network policy), authorization as an index-level pre-filter, physical partitions for hard barriers.</w:t>
+      </w:r>
+    </w:p>
+    <w:p>
+      <w:pPr>
+        <w:pStyle w:val="ListBullet"/>
+        <w:spacing w:after="60"/>
+      </w:pPr>
+      <w:r>
+        <w:rPr>
+          <w:b/>
+        </w:rPr>
+        <w:t xml:space="preserve">C28 consolidation-job governance and C32 agent identity. </w:t>
+      </w:r>
+      <w:r>
+        <w:t>Background writers and every delegating agent operate as identified gateway actors from the first pilot.</w:t>
+      </w:r>
+    </w:p>
+    <w:p>
+      <w:pPr>
+        <w:pStyle w:val="Heading2"/>
+      </w:pPr>
+      <w:r>
+        <w:t>Phase 2 — Near-term maturity</w:t>
+      </w:r>
+    </w:p>
+    <w:p>
+      <w:pPr>
+        <w:pStyle w:val="ListBullet"/>
+        <w:spacing w:after="50"/>
+      </w:pPr>
+      <w:r>
+        <w:t>C14 unified subject-rights orchestration and C25 backup/restore compliance.</w:t>
+      </w:r>
+    </w:p>
+    <w:p>
+      <w:pPr>
+        <w:pStyle w:val="ListBullet"/>
+        <w:spacing w:after="50"/>
+      </w:pPr>
+      <w:r>
+        <w:lastRenderedPageBreak/>
+        <w:t>C15 graph ontology/schema migration governance.</w:t>
+      </w:r>
+    </w:p>
+    <w:p>
+      <w:pPr>
+        <w:pStyle w:val="ListBullet"/>
+        <w:spacing w:after="50"/>
+      </w:pPr>
+      <w:r>
+        <w:t>C6 drift/staleness/contradiction monitoring and C22 confidence/calibration research.</w:t>
+      </w:r>
+    </w:p>
+    <w:p>
+      <w:pPr>
+        <w:pStyle w:val="ListBullet"/>
+        <w:spacing w:after="50"/>
+      </w:pPr>
+      <w:r>
+        <w:t>C18 degraded-mode/failover, portable export and C27 backend migration testing.</w:t>
+      </w:r>
+    </w:p>
+    <w:p>
+      <w:pPr>
+        <w:pStyle w:val="ListBullet"/>
+        <w:spacing w:after="50"/>
+      </w:pPr>
+      <w:r>
+        <w:t>Formal DPIA/use-case risk documentation; technical documentation for AI Act-scoped applications.</w:t>
+      </w:r>
+    </w:p>
+    <w:p>
+      <w:pPr>
+        <w:pStyle w:val="ListBullet"/>
+        <w:spacing w:after="50"/>
+      </w:pPr>
+      <w:r>
+        <w:t>Backend conformance suite covering Memoria and Graphiti first, then Mem0/Zep as they are onboarded.</w:t>
+      </w:r>
+    </w:p>
+    <w:p>
+      <w:pPr>
+        <w:pStyle w:val="ListBullet"/>
+        <w:spacing w:after="60"/>
+      </w:pPr>
+      <w:r>
+        <w:rPr>
+          <w:b/>
+        </w:rPr>
+        <w:t xml:space="preserve">Minimum viable governed memory pilot. </w:t>
+      </w:r>
+      <w:r>
+        <w:t>Deploy the Section 12.2 internal-only MVGM control set on one real internal workflow by end of Q4 2026, so that Phase 3 drift, calibration and contagion research has production traces rather than benchmark data, and so that the latency budget and bypass-prevention design are tested under load before the client-facing tier is attempted.</w:t>
+      </w:r>
+    </w:p>
+    <w:p>
+      <w:pPr>
+        <w:pStyle w:val="Heading2"/>
+      </w:pPr>
+      <w:r>
+        <w:t>Phase 3 — Research frontier: policy-aware and self-evolving memory</w:t>
+      </w:r>
+    </w:p>
+    <w:p>
+      <w:pPr>
+        <w:pStyle w:val="ListBullet"/>
+        <w:spacing w:after="50"/>
+      </w:pPr>
+      <w:r>
+        <w:rPr>
+          <w:b/>
+        </w:rPr>
+        <w:t xml:space="preserve">Governed write policy. </w:t>
+      </w:r>
+      <w:r>
+        <w:t>Learn what should be remembered subject to purpose, sensitivity, authority, expected future utility and cost.</w:t>
+      </w:r>
+    </w:p>
+    <w:p>
+      <w:pPr>
+        <w:pStyle w:val="ListBullet"/>
+        <w:spacing w:after="50"/>
+      </w:pPr>
+      <w:r>
+        <w:rPr>
+          <w:b/>
+        </w:rPr>
+        <w:t xml:space="preserve">Trust-aware reconciliation. </w:t>
+      </w:r>
+      <w:r>
+        <w:t>Resolve conflicts using source authority, temporal validity, confidence and verification rather than similarity/recency alone.</w:t>
+      </w:r>
+    </w:p>
+    <w:p>
+      <w:pPr>
+        <w:pStyle w:val="ListBullet"/>
+        <w:spacing w:after="60"/>
+      </w:pPr>
+      <w:r>
+        <w:rPr>
+          <w:b/>
+        </w:rPr>
+        <w:t xml:space="preserve">C29 promotion gate and certified graph unlearning. </w:t>
+      </w:r>
+      <w:r>
+        <w:t>Operationalise the memory→skill promotion gate; adapt a certified graph-unlearning method to Graphiti's bi-temporal structure for C2 (Section 8).</w:t>
+      </w:r>
+    </w:p>
+    <w:p>
+      <w:pPr>
+        <w:pStyle w:val="ListBullet"/>
+        <w:spacing w:after="60"/>
+      </w:pPr>
+      <w:r>
+        <w:rPr>
+          <w:b/>
+        </w:rPr>
+        <w:t xml:space="preserve">C33 model-change impact analysis and bias-contagion monitoring. </w:t>
+      </w:r>
+      <w:r>
+        <w:t>Re-embedding impact analysis on backbone change; upstream experience-stream sampling for Memory-Contagion-class bias (C6).</w:t>
+      </w:r>
+    </w:p>
+    <w:p>
+      <w:pPr>
+        <w:pStyle w:val="ListBullet"/>
+        <w:spacing w:after="50"/>
+      </w:pPr>
+      <w:r>
+        <w:rPr>
+          <w:b/>
+        </w:rPr>
+        <w:t xml:space="preserve">Compliance-aware promotion. </w:t>
+      </w:r>
+      <w:r>
+        <w:t>Before episodic memory becomes semantic knowledge, procedure or skill, re-evaluate provenance, authorization, transferability and downstream risk.</w:t>
+      </w:r>
+    </w:p>
+    <w:p>
+      <w:pPr>
+        <w:pStyle w:val="ListBullet"/>
+        <w:spacing w:after="50"/>
+      </w:pPr>
+      <w:r>
+        <w:rPr>
+          <w:b/>
+        </w:rPr>
+        <w:t xml:space="preserve">Memory drift observability. </w:t>
+      </w:r>
+      <w:r>
+        <w:t>Track semantic, procedural and governance drift across time and versions.</w:t>
+      </w:r>
+    </w:p>
+    <w:p>
+      <w:pPr>
+        <w:pStyle w:val="ListBullet"/>
+        <w:spacing w:after="50"/>
+      </w:pPr>
+      <w:r>
+        <w:rPr>
+          <w:b/>
+        </w:rPr>
+        <w:t xml:space="preserve">Automated policy enforcement research. </w:t>
+      </w:r>
+      <w:r>
+        <w:t>Investigate how much retention, restriction, deletion, confidence and purpose logic can be machine-assisted without delegating legal interpretation to the model.</w:t>
+      </w:r>
+    </w:p>
+    <w:p>
+      <w:pPr>
+        <w:pStyle w:val="Heading1"/>
+      </w:pPr>
+      <w:r>
+        <w:t>17. Open Research and Policy Questions</w:t>
+      </w:r>
+    </w:p>
+    <w:p>
+      <w:pPr>
+        <w:pStyle w:val="ListNumber"/>
+        <w:spacing w:after="60"/>
+      </w:pPr>
+      <w:r>
+        <w:rPr>
+          <w:b/>
+        </w:rPr>
+        <w:t xml:space="preserve">No standard memory object. </w:t>
+      </w:r>
+      <w:r>
+        <w:t>There is no widely accepted schema for provenance, temporal validity, purpose, authority, confidence and lifecycle state across graph/vector/text memory.</w:t>
+      </w:r>
+    </w:p>
+    <w:p>
+      <w:pPr>
+        <w:pStyle w:val="ListNumber"/>
+        <w:spacing w:after="60"/>
+      </w:pPr>
+      <w:r>
+        <w:rPr>
+          <w:b/>
+        </w:rPr>
+        <w:t xml:space="preserve">No accepted memory-erasure benchmark. </w:t>
+      </w:r>
+      <w:r>
+        <w:t>Backend APIs expose deletion primitives, but end-to-end proof of erasure across vectors, graphs, summaries, caches and backups lacks a standard test methodology.</w:t>
+      </w:r>
+    </w:p>
+    <w:p>
+      <w:pPr>
+        <w:pStyle w:val="ListNumber"/>
+        <w:spacing w:after="60"/>
+      </w:pPr>
+      <w:r>
+        <w:rPr>
+          <w:b/>
+        </w:rPr>
+        <w:t xml:space="preserve">No mature lineage standard for consolidation/promotion. </w:t>
+      </w:r>
+      <w:r>
+        <w:t>When multiple episodes are compressed into one semantic memory or procedure, attribution and deletion become difficult.</w:t>
+      </w:r>
+    </w:p>
+    <w:p>
+      <w:pPr>
+        <w:pStyle w:val="ListNumber"/>
+        <w:spacing w:after="60"/>
+      </w:pPr>
+      <w:r>
+        <w:rPr>
+          <w:b/>
+        </w:rPr>
+        <w:t xml:space="preserve">No settled governance model for inferred memory. </w:t>
+      </w:r>
+      <w:r>
+        <w:t>Observed, extracted, inferred and predicted attributes raise different risks, but memory frameworks often collapse them into the same record type.</w:t>
+      </w:r>
+    </w:p>
+    <w:p>
+      <w:pPr>
+        <w:pStyle w:val="ListNumber"/>
+        <w:spacing w:after="60"/>
+      </w:pPr>
+      <w:r>
+        <w:rPr>
+          <w:b/>
+        </w:rPr>
+        <w:t xml:space="preserve">No clear boundary between memory and regulated record. </w:t>
+      </w:r>
+      <w:r>
+        <w:t>Applications need rules for when an agent transcript, summary, graph fact or recommendation becomes an official business record or system-of-record input.</w:t>
+      </w:r>
+    </w:p>
+    <w:p>
+      <w:pPr>
+        <w:pStyle w:val="ListNumber"/>
+        <w:spacing w:after="60"/>
+      </w:pPr>
+      <w:r>
+        <w:rPr>
+          <w:b/>
+        </w:rPr>
+        <w:t xml:space="preserve">No standard for purpose-aware retrieval. </w:t>
+      </w:r>
+      <w:r>
+        <w:t>Memory systems optimize relevance; regulated enterprise systems also need authorization, information barriers and purpose compatibility before retrieval.</w:t>
+      </w:r>
+    </w:p>
+    <w:p>
+      <w:pPr>
+        <w:pStyle w:val="ListBullet"/>
+        <w:spacing w:after="60"/>
+      </w:pPr>
+      <w:r>
+        <w:rPr>
+          <w:b/>
+        </w:rPr>
+        <w:t xml:space="preserve">No standard governance-metric set. </w:t>
+      </w:r>
+      <w:r>
+        <w:t>Leakage, forgetting and freshness constructs exist in the literature (Section 15.0) but there is no accepted, comparable metric suite for governed memory, and no published metric pairs governance ratios with utility to prevent the empty-store degenerate optimum.</w:t>
+      </w:r>
+    </w:p>
+    <w:p>
+      <w:pPr>
+        <w:pStyle w:val="ListNumber"/>
+        <w:spacing w:after="60"/>
+      </w:pPr>
+      <w:r>
+        <w:rPr>
+          <w:b/>
+        </w:rPr>
+        <w:t xml:space="preserve">No mature policy for memory-to-skill promotion. </w:t>
+      </w:r>
+      <w:r>
+        <w:t>Self-evolving agents can convert transient errors into persistent procedures; validation, approval, monitoring, deprecation and rollback resemble CI/CD but lack standard practice.</w:t>
+      </w:r>
+    </w:p>
+    <w:p>
+      <w:pPr>
+        <w:pStyle w:val="ListNumber"/>
         <w:spacing w:after="60"/>
       </w:pPr>
       <w:r>
@@ -10785,48 +11462,10 @@
           <w:b/>
         </w:rPr>
         <w:lastRenderedPageBreak/>
-        <w:t xml:space="preserve">Effective Policy Coverage (EPC). </w:t>
-      </w:r>
-      <w:r>
-        <w:t>Persisted memories with a resolvable effective_policy_hash ÷ persisted memories. Target: 100%; an unpolicied memory is a defect.</w:t>
-      </w:r>
-    </w:p>
-    <w:p>
-      <w:pPr>
-        <w:pStyle w:val="ListBullet"/>
-        <w:spacing w:after="60"/>
-      </w:pPr>
-      <w:r>
-        <w:rPr>
-          <w:b/>
-        </w:rPr>
-        <w:t xml:space="preserve">Time-to-Erasure (TTE). </w:t>
-      </w:r>
-      <w:r>
-        <w:t>Elapsed time from a valid deletion request to physical-layer verification across all representations, against the retention/rights SLA.</w:t>
-      </w:r>
-    </w:p>
-    <w:p>
-      <w:pPr>
-        <w:pStyle w:val="ListBullet"/>
-        <w:spacing w:after="60"/>
-      </w:pPr>
-      <w:r>
-        <w:rPr>
-          <w:b/>
-        </w:rPr>
-        <w:t xml:space="preserve">Consolidation Review Rejection Rate. </w:t>
-      </w:r>
-      <w:r>
-        <w:t>Proposed consolidation diffs rejected by policy check or reviewer ÷ proposed diffs; a rising rate indicates upstream contamination (Memory Contagion) or extractor drift.</w:t>
-      </w:r>
-    </w:p>
-    <w:p>
-      <w:pPr>
-        <w:spacing w:after="100" w:line="252" w:lineRule="auto"/>
-      </w:pPr>
-      <w:r>
-        <w:t>SMUR as defined requires an attribution rule: retrieved is not used. A workable proxy is "present in the assembled context and referenced in the output"; the specification should state the rule so that the metric is comparable across releases. "Effectively zero" targets should be read as zero in conformance runs and an alert on first occurrence in production, measured by canaries.</w:t>
+        <w:t xml:space="preserve">Platform criticality can change over time. </w:t>
+      </w:r>
+      <w:r>
+        <w:t>An internal memory capability can become shared infrastructure. Governance should be able to scale with criticality, concentration and client-facing use without redesigning the entire memory substrate.</w:t>
       </w:r>
     </w:p>
     <w:p>
@@ -10834,566 +11473,6 @@
         <w:pStyle w:val="Heading1"/>
       </w:pPr>
       <w:r>
-        <w:t>16. Recommended Implementation and Research Roadmap</w:t>
-      </w:r>
-    </w:p>
-    <w:p>
-      <w:pPr>
-        <w:pStyle w:val="Heading2"/>
-      </w:pPr>
-      <w:r>
-        <w:t>Phase 0 — Legal / scope confirmation</w:t>
-      </w:r>
-    </w:p>
-    <w:p>
-      <w:pPr>
-        <w:pStyle w:val="ListBullet"/>
-        <w:spacing w:after="50"/>
-      </w:pPr>
-      <w:r>
-        <w:rPr>
-          <w:b/>
-        </w:rPr>
-        <w:t xml:space="preserve">Use-case classification. </w:t>
-      </w:r>
-      <w:r>
-        <w:t>Determine where memory will be used: internal research, advisory workflow, client-facing application, decision support, or platform infrastructure.</w:t>
-      </w:r>
-    </w:p>
-    <w:p>
-      <w:pPr>
-        <w:pStyle w:val="ListBullet"/>
-        <w:spacing w:after="50"/>
-      </w:pPr>
-      <w:r>
-        <w:rPr>
-          <w:b/>
-        </w:rPr>
-        <w:t xml:space="preserve">Entity and jurisdiction mapping. </w:t>
-      </w:r>
-      <w:r>
-        <w:t>Identify relevant operating entities, data-subject locations, controller/processor roles, record categories, information barriers and applicable retention obligations.</w:t>
-      </w:r>
-    </w:p>
-    <w:p>
-      <w:pPr>
-        <w:pStyle w:val="ListBullet"/>
-        <w:spacing w:after="50"/>
-      </w:pPr>
-      <w:r>
-        <w:rPr>
-          <w:b/>
-        </w:rPr>
-        <w:t xml:space="preserve">Third-party relationship mapping. </w:t>
-      </w:r>
-      <w:r>
-        <w:t>Distinguish self-hosted OSS from hosted services and map the actual dependency/service chain.</w:t>
-      </w:r>
-    </w:p>
-    <w:p>
-      <w:pPr>
-        <w:pStyle w:val="ListBullet"/>
-        <w:spacing w:after="50"/>
-      </w:pPr>
-      <w:r>
-        <w:rPr>
-          <w:b/>
-        </w:rPr>
-        <w:t xml:space="preserve">Legal review. </w:t>
-      </w:r>
-      <w:r>
-        <w:t>Confirm GDPR legal bases, special-category handling, international transfers, Regulation S-P scope, adviser recordkeeping, and high-risk AI Act applicability by use case.</w:t>
-      </w:r>
-    </w:p>
-    <w:p>
-      <w:pPr>
-        <w:pStyle w:val="ListBullet"/>
-        <w:spacing w:after="60"/>
-      </w:pPr>
-      <w:r>
-        <w:rPr>
-          <w:b/>
-        </w:rPr>
-        <w:t xml:space="preserve">Governance latency budget. </w:t>
-      </w:r>
-      <w:r>
-        <w:t>Set the p95 governance-overhead budget per memory operation on the retrieval hot path (Section 9.1); it is a design input, not a tuning parameter.</w:t>
-      </w:r>
-    </w:p>
-    <w:p>
-      <w:pPr>
-        <w:pStyle w:val="ListBullet"/>
-        <w:spacing w:after="60"/>
-      </w:pPr>
-      <w:r>
-        <w:rPr>
-          <w:b/>
-        </w:rPr>
-        <w:t xml:space="preserve">Bank-supervised entity check. </w:t>
-      </w:r>
-      <w:r>
-        <w:t>Confirm whether any entity operating memory is separately Fed/OCC/FDIC-supervised; if so SR 26-2 becomes directly binding rather than an analogue (Section 5.4).</w:t>
-      </w:r>
-    </w:p>
-    <w:p>
-      <w:pPr>
-        <w:pStyle w:val="Heading2"/>
-      </w:pPr>
-      <w:r>
-        <w:t>Phase 1 — Foundational controls before production persistent memory</w:t>
-      </w:r>
-    </w:p>
-    <w:p>
-      <w:pPr>
-        <w:pStyle w:val="ListBullet"/>
-        <w:spacing w:after="50"/>
-      </w:pPr>
-      <w:r>
-        <w:t>C1 lineage/provenance and C26 technology-version lineage.</w:t>
-      </w:r>
-    </w:p>
-    <w:p>
-      <w:pPr>
-        <w:pStyle w:val="ListBullet"/>
-        <w:spacing w:after="50"/>
-      </w:pPr>
-      <w:r>
-        <w:t>C13 purpose/legal-basis binding and C21 purpose-bound use authorization.</w:t>
-      </w:r>
-    </w:p>
-    <w:p>
-      <w:pPr>
-        <w:pStyle w:val="ListBullet"/>
-        <w:spacing w:after="50"/>
-      </w:pPr>
-      <w:r>
-        <w:t>C16 observed/extracted/inferred/derived classification and C20 source-authority hierarchy.</w:t>
-      </w:r>
-    </w:p>
-    <w:p>
-      <w:pPr>
-        <w:pStyle w:val="ListBullet"/>
-        <w:spacing w:after="50"/>
-      </w:pPr>
-      <w:r>
-        <w:t>C17 tenant/semantic isolation, C19 information barriers/MNPI, C23 operation-level authorization.</w:t>
-      </w:r>
-    </w:p>
-    <w:p>
-      <w:pPr>
-        <w:pStyle w:val="ListBullet"/>
-        <w:spacing w:after="50"/>
-      </w:pPr>
-      <w:r>
-        <w:t>C11 provider/region/egress pinning and full data-flow inventory.</w:t>
-      </w:r>
-    </w:p>
-    <w:p>
-      <w:pPr>
-        <w:pStyle w:val="ListBullet"/>
-        <w:spacing w:after="50"/>
-      </w:pPr>
-      <w:r>
-        <w:t>C3 tamper-evident audit trail that avoids copying sensitive content unnecessarily.</w:t>
-      </w:r>
-    </w:p>
-    <w:p>
-      <w:pPr>
-        <w:pStyle w:val="ListBullet"/>
-        <w:spacing w:after="50"/>
-      </w:pPr>
-      <w:r>
-        <w:t>C7 retention/legal hold and C24 lifecycle states.</w:t>
-      </w:r>
-    </w:p>
-    <w:p>
-      <w:pPr>
-        <w:pStyle w:val="ListBullet"/>
-        <w:spacing w:after="50"/>
-      </w:pPr>
-      <w:r>
-        <w:t>C2 end-to-end deletion primitives with verification.</w:t>
-      </w:r>
-    </w:p>
-    <w:p>
-      <w:pPr>
-        <w:pStyle w:val="ListBullet"/>
-        <w:spacing w:after="50"/>
-      </w:pPr>
-      <w:r>
-        <w:t>C5/C10 OSS security and threat-model controls.</w:t>
-      </w:r>
-    </w:p>
-    <w:p>
-      <w:pPr>
-        <w:pStyle w:val="ListBullet"/>
-        <w:spacing w:after="60"/>
-      </w:pPr>
-      <w:r>
-        <w:rPr>
-          <w:b/>
-        </w:rPr>
-        <w:t xml:space="preserve">Architecture hardening (Section 9.1). </w:t>
-      </w:r>
-      <w:r>
-        <w:t>Enforced bypass prevention (backend credentials only in the gateway, mTLS, network policy), authorization as an index-level pre-filter, physical partitions for hard barriers.</w:t>
-      </w:r>
-    </w:p>
-    <w:p>
-      <w:pPr>
-        <w:pStyle w:val="ListBullet"/>
-        <w:spacing w:after="60"/>
-      </w:pPr>
-      <w:r>
-        <w:rPr>
-          <w:b/>
-        </w:rPr>
-        <w:t xml:space="preserve">C28 consolidation-job governance and C32 agent identity. </w:t>
-      </w:r>
-      <w:r>
-        <w:t>Background writers and every delegating agent operate as identified gateway actors from the first pilot.</w:t>
-      </w:r>
-    </w:p>
-    <w:p>
-      <w:pPr>
-        <w:pStyle w:val="Heading2"/>
-      </w:pPr>
-      <w:r>
-        <w:t>Phase 2 — Near-term maturity</w:t>
-      </w:r>
-    </w:p>
-    <w:p>
-      <w:pPr>
-        <w:pStyle w:val="ListBullet"/>
-        <w:spacing w:after="50"/>
-      </w:pPr>
-      <w:r>
-        <w:t>C14 unified subject-rights orchestration and C25 backup/restore compliance.</w:t>
-      </w:r>
-    </w:p>
-    <w:p>
-      <w:pPr>
-        <w:pStyle w:val="ListBullet"/>
-        <w:spacing w:after="50"/>
-      </w:pPr>
-      <w:r>
-        <w:t>C15 graph ontology/schema migration governance.</w:t>
-      </w:r>
-    </w:p>
-    <w:p>
-      <w:pPr>
-        <w:pStyle w:val="ListBullet"/>
-        <w:spacing w:after="50"/>
-      </w:pPr>
-      <w:r>
-        <w:t>C6 drift/staleness/contradiction monitoring and C22 confidence/calibration research.</w:t>
-      </w:r>
-    </w:p>
-    <w:p>
-      <w:pPr>
-        <w:pStyle w:val="ListBullet"/>
-        <w:spacing w:after="50"/>
-      </w:pPr>
-      <w:r>
-        <w:lastRenderedPageBreak/>
-        <w:t>C18 degraded-mode/failover, portable export and C27 backend migration testing.</w:t>
-      </w:r>
-    </w:p>
-    <w:p>
-      <w:pPr>
-        <w:pStyle w:val="ListBullet"/>
-        <w:spacing w:after="50"/>
-      </w:pPr>
-      <w:r>
-        <w:t>Formal DPIA/use-case risk documentation; technical documentation for AI Act-scoped applications.</w:t>
-      </w:r>
-    </w:p>
-    <w:p>
-      <w:pPr>
-        <w:pStyle w:val="ListBullet"/>
-        <w:spacing w:after="50"/>
-      </w:pPr>
-      <w:r>
-        <w:t>Backend conformance suite covering Memoria and Graphiti first, then Mem0/Zep as they are onboarded.</w:t>
-      </w:r>
-    </w:p>
-    <w:p>
-      <w:pPr>
-        <w:pStyle w:val="ListBullet"/>
-        <w:spacing w:after="60"/>
-      </w:pPr>
-      <w:r>
-        <w:rPr>
-          <w:b/>
-        </w:rPr>
-        <w:t xml:space="preserve">Minimum viable governed memory pilot. </w:t>
-      </w:r>
-      <w:r>
-        <w:t>Deploy the Section 12.2 internal-only MVGM control set on one real internal workflow by end of Q4 2026, so that Phase 3 drift, calibration and contagion research has production traces rather than benchmark data, and so that the latency budget and bypass-prevention design are tested under load before the client-facing tier is attempted.</w:t>
-      </w:r>
-    </w:p>
-    <w:p>
-      <w:pPr>
-        <w:pStyle w:val="Heading2"/>
-      </w:pPr>
-      <w:r>
-        <w:t>Phase 3 — Research frontier: policy-aware and self-evolving memory</w:t>
-      </w:r>
-    </w:p>
-    <w:p>
-      <w:pPr>
-        <w:pStyle w:val="ListBullet"/>
-        <w:spacing w:after="50"/>
-      </w:pPr>
-      <w:r>
-        <w:rPr>
-          <w:b/>
-        </w:rPr>
-        <w:t xml:space="preserve">Governed write policy. </w:t>
-      </w:r>
-      <w:r>
-        <w:t>Learn what should be remembered subject to purpose, sensitivity, authority, expected future utility and cost.</w:t>
-      </w:r>
-    </w:p>
-    <w:p>
-      <w:pPr>
-        <w:pStyle w:val="ListBullet"/>
-        <w:spacing w:after="50"/>
-      </w:pPr>
-      <w:r>
-        <w:rPr>
-          <w:b/>
-        </w:rPr>
-        <w:t xml:space="preserve">Trust-aware reconciliation. </w:t>
-      </w:r>
-      <w:r>
-        <w:t>Resolve conflicts using source authority, temporal validity, confidence and verification rather than similarity/recency alone.</w:t>
-      </w:r>
-    </w:p>
-    <w:p>
-      <w:pPr>
-        <w:pStyle w:val="ListBullet"/>
-        <w:spacing w:after="60"/>
-      </w:pPr>
-      <w:r>
-        <w:rPr>
-          <w:b/>
-        </w:rPr>
-        <w:t xml:space="preserve">C29 promotion gate and certified graph unlearning. </w:t>
-      </w:r>
-      <w:r>
-        <w:t>Operationalise the memory→skill promotion gate; adapt a certified graph-unlearning method to Graphiti's bi-temporal structure for C2 (Section 8).</w:t>
-      </w:r>
-    </w:p>
-    <w:p>
-      <w:pPr>
-        <w:pStyle w:val="ListBullet"/>
-        <w:spacing w:after="60"/>
-      </w:pPr>
-      <w:r>
-        <w:rPr>
-          <w:b/>
-        </w:rPr>
-        <w:t xml:space="preserve">C33 model-change impact analysis and bias-contagion monitoring. </w:t>
-      </w:r>
-      <w:r>
-        <w:t>Re-embedding impact analysis on backbone change; upstream experience-stream sampling for Memory-Contagion-class bias (C6).</w:t>
-      </w:r>
-    </w:p>
-    <w:p>
-      <w:pPr>
-        <w:pStyle w:val="ListBullet"/>
-        <w:spacing w:after="50"/>
-      </w:pPr>
-      <w:r>
-        <w:rPr>
-          <w:b/>
-        </w:rPr>
-        <w:t xml:space="preserve">Compliance-aware promotion. </w:t>
-      </w:r>
-      <w:r>
-        <w:t>Before episodic memory becomes semantic knowledge, procedure or skill, re-evaluate provenance, authorization, transferability and downstream risk.</w:t>
-      </w:r>
-    </w:p>
-    <w:p>
-      <w:pPr>
-        <w:pStyle w:val="ListBullet"/>
-        <w:spacing w:after="50"/>
-      </w:pPr>
-      <w:r>
-        <w:rPr>
-          <w:b/>
-        </w:rPr>
-        <w:t xml:space="preserve">Memory drift observability. </w:t>
-      </w:r>
-      <w:r>
-        <w:t>Track semantic, procedural and governance drift across time and versions.</w:t>
-      </w:r>
-    </w:p>
-    <w:p>
-      <w:pPr>
-        <w:pStyle w:val="ListBullet"/>
-        <w:spacing w:after="50"/>
-      </w:pPr>
-      <w:r>
-        <w:rPr>
-          <w:b/>
-        </w:rPr>
-        <w:t xml:space="preserve">Automated policy enforcement research. </w:t>
-      </w:r>
-      <w:r>
-        <w:t>Investigate how much retention, restriction, deletion, confidence and purpose logic can be machine-assisted without delegating legal interpretation to the model.</w:t>
-      </w:r>
-    </w:p>
-    <w:p>
-      <w:pPr>
-        <w:pStyle w:val="Heading1"/>
-      </w:pPr>
-      <w:r>
-        <w:t>17. Open Research and Policy Questions</w:t>
-      </w:r>
-    </w:p>
-    <w:p>
-      <w:pPr>
-        <w:pStyle w:val="ListNumber"/>
-        <w:spacing w:after="60"/>
-      </w:pPr>
-      <w:r>
-        <w:rPr>
-          <w:b/>
-        </w:rPr>
-        <w:t xml:space="preserve">No standard memory object. </w:t>
-      </w:r>
-      <w:r>
-        <w:t>There is no widely accepted schema for provenance, temporal validity, purpose, authority, confidence and lifecycle state across graph/vector/text memory.</w:t>
-      </w:r>
-    </w:p>
-    <w:p>
-      <w:pPr>
-        <w:pStyle w:val="ListNumber"/>
-        <w:spacing w:after="60"/>
-      </w:pPr>
-      <w:r>
-        <w:rPr>
-          <w:b/>
-        </w:rPr>
-        <w:t xml:space="preserve">No accepted memory-erasure benchmark. </w:t>
-      </w:r>
-      <w:r>
-        <w:t>Backend APIs expose deletion primitives, but end-to-end proof of erasure across vectors, graphs, summaries, caches and backups lacks a standard test methodology.</w:t>
-      </w:r>
-    </w:p>
-    <w:p>
-      <w:pPr>
-        <w:pStyle w:val="ListNumber"/>
-        <w:spacing w:after="60"/>
-      </w:pPr>
-      <w:r>
-        <w:rPr>
-          <w:b/>
-        </w:rPr>
-        <w:t xml:space="preserve">No mature lineage standard for consolidation/promotion. </w:t>
-      </w:r>
-      <w:r>
-        <w:t>When multiple episodes are compressed into one semantic memory or procedure, attribution and deletion become difficult.</w:t>
-      </w:r>
-    </w:p>
-    <w:p>
-      <w:pPr>
-        <w:pStyle w:val="ListNumber"/>
-        <w:spacing w:after="60"/>
-      </w:pPr>
-      <w:r>
-        <w:rPr>
-          <w:b/>
-        </w:rPr>
-        <w:t xml:space="preserve">No settled governance model for inferred memory. </w:t>
-      </w:r>
-      <w:r>
-        <w:t>Observed, extracted, inferred and predicted attributes raise different risks, but memory frameworks often collapse them into the same record type.</w:t>
-      </w:r>
-    </w:p>
-    <w:p>
-      <w:pPr>
-        <w:pStyle w:val="ListNumber"/>
-        <w:spacing w:after="60"/>
-      </w:pPr>
-      <w:r>
-        <w:rPr>
-          <w:b/>
-        </w:rPr>
-        <w:t xml:space="preserve">No clear boundary between memory and regulated record. </w:t>
-      </w:r>
-      <w:r>
-        <w:t>Applications need rules for when an agent transcript, summary, graph fact or recommendation becomes an official business record or system-of-record input.</w:t>
-      </w:r>
-    </w:p>
-    <w:p>
-      <w:pPr>
-        <w:pStyle w:val="ListNumber"/>
-        <w:spacing w:after="60"/>
-      </w:pPr>
-      <w:r>
-        <w:rPr>
-          <w:b/>
-        </w:rPr>
-        <w:t xml:space="preserve">No standard for purpose-aware retrieval. </w:t>
-      </w:r>
-      <w:r>
-        <w:t>Memory systems optimize relevance; regulated enterprise systems also need authorization, information barriers and purpose compatibility before retrieval.</w:t>
-      </w:r>
-    </w:p>
-    <w:p>
-      <w:pPr>
-        <w:pStyle w:val="ListBullet"/>
-        <w:spacing w:after="60"/>
-      </w:pPr>
-      <w:r>
-        <w:rPr>
-          <w:b/>
-        </w:rPr>
-        <w:t xml:space="preserve">No standard governance-metric set. </w:t>
-      </w:r>
-      <w:r>
-        <w:t>Leakage, forgetting and freshness constructs exist in the literature (Section 15.0) but there is no accepted, comparable metric suite for governed memory, and no published metric pairs governance ratios with utility to prevent the empty-store degenerate optimum.</w:t>
-      </w:r>
-    </w:p>
-    <w:p>
-      <w:pPr>
-        <w:pStyle w:val="ListNumber"/>
-        <w:spacing w:after="60"/>
-      </w:pPr>
-      <w:r>
-        <w:rPr>
-          <w:b/>
-        </w:rPr>
-        <w:t xml:space="preserve">No mature policy for memory-to-skill promotion. </w:t>
-      </w:r>
-      <w:r>
-        <w:t>Self-evolving agents can convert transient errors into persistent procedures; validation, approval, monitoring, deprecation and rollback resemble CI/CD but lack standard practice.</w:t>
-      </w:r>
-    </w:p>
-    <w:p>
-      <w:pPr>
-        <w:pStyle w:val="ListNumber"/>
-        <w:spacing w:after="60"/>
-      </w:pPr>
-      <w:r>
-        <w:rPr>
-          <w:b/>
-        </w:rPr>
-        <w:t xml:space="preserve">Platform criticality can change over time. </w:t>
-      </w:r>
-      <w:r>
-        <w:t>An internal memory capability can become shared infrastructure. Governance should be able to scale with criticality, concentration and client-facing use without redesigning the entire memory substrate.</w:t>
-      </w:r>
-    </w:p>
-    <w:p>
-      <w:pPr>
-        <w:pStyle w:val="Heading1"/>
-      </w:pPr>
-      <w:r>
-        <w:lastRenderedPageBreak/>
         <w:t>18. Draft Trustworthy Agent Memory Principles</w:t>
       </w:r>
     </w:p>
@@ -11619,6 +11698,7 @@
     </w:p>
     <w:p>
       <w:r>
+        <w:lastRenderedPageBreak/>
         <w:br w:type="page"/>
       </w:r>
     </w:p>

</xml_diff>